<commit_message>
add  docker-compose.local; ajustado layout dos relatórios
</commit_message>
<xml_diff>
--- a/Modelos/definitivos/Modelo - RLM.docx
+++ b/Modelos/definitivos/Modelo - RLM.docx
@@ -2,6 +2,481 @@
 <file path=word/document.xml><?xml version="1.0" encoding="utf-8"?>
 <w:document xmlns:wpc="http://schemas.microsoft.com/office/word/2010/wordprocessingCanvas" xmlns:cx="http://schemas.microsoft.com/office/drawing/2014/chartex" xmlns:cx1="http://schemas.microsoft.com/office/drawing/2015/9/8/chartex" xmlns:cx2="http://schemas.microsoft.com/office/drawing/2015/10/21/chartex" xmlns:cx3="http://schemas.microsoft.com/office/drawing/2016/5/9/chartex" xmlns:cx4="http://schemas.microsoft.com/office/drawing/2016/5/10/chartex" xmlns:cx5="http://schemas.microsoft.com/office/drawing/2016/5/11/chartex" xmlns:cx6="http://schemas.microsoft.com/office/drawing/2016/5/12/chartex" xmlns:cx7="http://schemas.microsoft.com/office/drawing/2016/5/13/chartex" xmlns:cx8="http://schemas.microsoft.com/office/drawing/2016/5/14/chartex" xmlns:mc="http://schemas.openxmlformats.org/markup-compatibility/2006" xmlns:aink="http://schemas.microsoft.com/office/drawing/2016/ink" xmlns:am3d="http://schemas.microsoft.com/office/drawing/2017/model3d" xmlns:o="urn:schemas-microsoft-com:office:office" xmlns:oel="http://schemas.microsoft.com/office/2019/extlst" xmlns:r="http://schemas.openxmlformats.org/officeDocument/2006/relationships" xmlns:m="http://schemas.openxmlformats.org/officeDocument/2006/math" xmlns:v="urn:schemas-microsoft-com:vml" xmlns:wp14="http://schemas.microsoft.com/office/word/2010/wordprocessingDrawing" xmlns:wp="http://schemas.openxmlformats.org/drawingml/2006/wordprocessingDrawing" xmlns:w10="urn:schemas-microsoft-com:office:word" xmlns:w="http://schemas.openxmlformats.org/wordprocessingml/2006/main" xmlns:w14="http://schemas.microsoft.com/office/word/2010/wordml" xmlns:w15="http://schemas.microsoft.com/office/word/2012/wordml" xmlns:w16cex="http://schemas.microsoft.com/office/word/2018/wordml/cex" xmlns:w16cid="http://schemas.microsoft.com/office/word/2016/wordml/cid" xmlns:w16="http://schemas.microsoft.com/office/word/2018/wordml" xmlns:w16du="http://schemas.microsoft.com/office/word/2023/wordml/word16du" xmlns:w16sdtdh="http://schemas.microsoft.com/office/word/2020/wordml/sdtdatahash" xmlns:w16sdtfl="http://schemas.microsoft.com/office/word/2024/wordml/sdtformatlock" xmlns:w16se="http://schemas.microsoft.com/office/word/2015/wordml/symex" xmlns:wpg="http://schemas.microsoft.com/office/word/2010/wordprocessingGroup" xmlns:wpi="http://schemas.microsoft.com/office/word/2010/wordprocessingInk" xmlns:wne="http://schemas.microsoft.com/office/word/2006/wordml" xmlns:wps="http://schemas.microsoft.com/office/word/2010/wordprocessingShape" mc:Ignorable="w14 w15 w16se w16cid w16 w16cex w16sdtdh w16sdtfl w16du wp14">
   <w:body>
+    <w:tbl>
+      <w:tblPr>
+        <w:tblpPr w:leftFromText="180" w:rightFromText="180" w:topFromText="180" w:bottomFromText="180" w:vertAnchor="text" w:horzAnchor="margin" w:tblpXSpec="center" w:tblpY="171"/>
+        <w:tblW w:w="10345" w:type="dxa"/>
+        <w:tblBorders>
+          <w:top w:val="single" w:sz="2" w:space="0" w:color="auto"/>
+          <w:left w:val="single" w:sz="2" w:space="0" w:color="auto"/>
+          <w:bottom w:val="single" w:sz="2" w:space="0" w:color="auto"/>
+          <w:right w:val="single" w:sz="2" w:space="0" w:color="auto"/>
+          <w:insideH w:val="single" w:sz="2" w:space="0" w:color="auto"/>
+          <w:insideV w:val="single" w:sz="2" w:space="0" w:color="auto"/>
+        </w:tblBorders>
+        <w:tblLayout w:type="fixed"/>
+        <w:tblCellMar>
+          <w:top w:w="102" w:type="dxa"/>
+          <w:left w:w="102" w:type="dxa"/>
+          <w:bottom w:w="102" w:type="dxa"/>
+          <w:right w:w="102" w:type="dxa"/>
+        </w:tblCellMar>
+        <w:tblLook w:val="0600" w:firstRow="0" w:lastRow="0" w:firstColumn="0" w:lastColumn="0" w:noHBand="1" w:noVBand="1"/>
+      </w:tblPr>
+      <w:tblGrid>
+        <w:gridCol w:w="4108"/>
+        <w:gridCol w:w="4253"/>
+        <w:gridCol w:w="1984"/>
+      </w:tblGrid>
+      <w:tr>
+        <w:trPr>
+          <w:trHeight w:val="177"/>
+        </w:trPr>
+        <w:tc>
+          <w:tcPr>
+            <w:tcW w:w="10345" w:type="dxa"/>
+            <w:gridSpan w:val="3"/>
+            <w:tcBorders>
+              <w:top w:val="single" w:sz="2" w:space="0" w:color="auto"/>
+              <w:left w:val="single" w:sz="2" w:space="0" w:color="auto"/>
+              <w:bottom w:val="single" w:sz="2" w:space="0" w:color="auto"/>
+              <w:right w:val="single" w:sz="2" w:space="0" w:color="auto"/>
+            </w:tcBorders>
+            <w:shd w:val="clear" w:color="auto" w:fill="30503E"/>
+            <w:vAlign w:val="center"/>
+          </w:tcPr>
+          <w:p>
+            <w:pPr>
+              <w:widowControl w:val="0"/>
+              <w:spacing w:line="216" w:lineRule="auto"/>
+              <w:jc w:val="center"/>
+              <w:rPr>
+                <w:b/>
+                <w:bCs/>
+                <w:color w:val="E8E8E8"/>
+                <w:sz w:val="18"/>
+                <w:szCs w:val="18"/>
+              </w:rPr>
+            </w:pPr>
+            <w:r>
+              <w:rPr>
+                <w:b/>
+                <w:bCs/>
+                <w:color w:val="E8E8E8"/>
+                <w:sz w:val="18"/>
+                <w:szCs w:val="18"/>
+              </w:rPr>
+              <w:t>INFORMAÇÕES DO SERVIÇO</w:t>
+            </w:r>
+          </w:p>
+        </w:tc>
+      </w:tr>
+      <w:tr>
+        <w:trPr>
+          <w:trHeight w:val="210"/>
+        </w:trPr>
+        <w:tc>
+          <w:tcPr>
+            <w:tcW w:w="4108" w:type="dxa"/>
+            <w:tcBorders>
+              <w:right w:val="single" w:sz="2" w:space="0" w:color="auto"/>
+            </w:tcBorders>
+          </w:tcPr>
+          <w:p>
+            <w:pPr>
+              <w:widowControl w:val="0"/>
+              <w:rPr>
+                <w:color w:val="11437E"/>
+                <w:sz w:val="18"/>
+                <w:szCs w:val="18"/>
+              </w:rPr>
+            </w:pPr>
+            <w:r>
+              <w:rPr>
+                <w:b/>
+                <w:bCs/>
+                <w:sz w:val="18"/>
+                <w:szCs w:val="18"/>
+              </w:rPr>
+              <w:t xml:space="preserve">Equipamento: </w:t>
+            </w:r>
+            <w:r>
+              <w:rPr>
+                <w:color w:val="11437E"/>
+                <w:sz w:val="18"/>
+                <w:szCs w:val="18"/>
+              </w:rPr>
+              <w:t>{{</w:t>
+            </w:r>
+            <w:proofErr w:type="spellStart"/>
+            <w:r>
+              <w:rPr>
+                <w:color w:val="11437E"/>
+                <w:sz w:val="18"/>
+                <w:szCs w:val="18"/>
+              </w:rPr>
+              <w:t>equipament</w:t>
+            </w:r>
+            <w:proofErr w:type="spellEnd"/>
+            <w:r>
+              <w:rPr>
+                <w:color w:val="11437E"/>
+                <w:sz w:val="18"/>
+                <w:szCs w:val="18"/>
+              </w:rPr>
+              <w:t>}}</w:t>
+            </w:r>
+          </w:p>
+        </w:tc>
+        <w:tc>
+          <w:tcPr>
+            <w:tcW w:w="4253" w:type="dxa"/>
+            <w:tcBorders>
+              <w:top w:val="single" w:sz="2" w:space="0" w:color="auto"/>
+              <w:left w:val="single" w:sz="2" w:space="0" w:color="auto"/>
+              <w:bottom w:val="single" w:sz="2" w:space="0" w:color="auto"/>
+              <w:right w:val="single" w:sz="2" w:space="0" w:color="auto"/>
+            </w:tcBorders>
+          </w:tcPr>
+          <w:p>
+            <w:pPr>
+              <w:widowControl w:val="0"/>
+              <w:rPr>
+                <w:color w:val="11437E"/>
+                <w:sz w:val="18"/>
+                <w:szCs w:val="18"/>
+              </w:rPr>
+            </w:pPr>
+            <w:r>
+              <w:rPr>
+                <w:b/>
+                <w:bCs/>
+                <w:sz w:val="18"/>
+                <w:szCs w:val="18"/>
+              </w:rPr>
+              <w:t>Material:</w:t>
+            </w:r>
+            <w:r>
+              <w:rPr>
+                <w:b/>
+                <w:bCs/>
+                <w:sz w:val="18"/>
+                <w:szCs w:val="18"/>
+              </w:rPr>
+              <w:t xml:space="preserve"> </w:t>
+            </w:r>
+            <w:r>
+              <w:rPr>
+                <w:color w:val="11437E"/>
+                <w:sz w:val="18"/>
+                <w:szCs w:val="18"/>
+              </w:rPr>
+              <w:t>{{</w:t>
+            </w:r>
+            <w:r>
+              <w:rPr>
+                <w:color w:val="11437E"/>
+                <w:sz w:val="18"/>
+                <w:szCs w:val="18"/>
+              </w:rPr>
+              <w:t>material</w:t>
+            </w:r>
+            <w:r>
+              <w:rPr>
+                <w:color w:val="11437E"/>
+                <w:sz w:val="18"/>
+                <w:szCs w:val="18"/>
+              </w:rPr>
+              <w:t>}}</w:t>
+            </w:r>
+          </w:p>
+        </w:tc>
+        <w:tc>
+          <w:tcPr>
+            <w:tcW w:w="1984" w:type="dxa"/>
+            <w:tcBorders>
+              <w:top w:val="single" w:sz="2" w:space="0" w:color="auto"/>
+              <w:left w:val="single" w:sz="2" w:space="0" w:color="auto"/>
+              <w:bottom w:val="single" w:sz="2" w:space="0" w:color="auto"/>
+              <w:right w:val="single" w:sz="2" w:space="0" w:color="auto"/>
+            </w:tcBorders>
+          </w:tcPr>
+          <w:p>
+            <w:pPr>
+              <w:widowControl w:val="0"/>
+              <w:rPr>
+                <w:b/>
+                <w:bCs/>
+                <w:sz w:val="18"/>
+                <w:szCs w:val="18"/>
+              </w:rPr>
+            </w:pPr>
+            <w:r>
+              <w:rPr>
+                <w:b/>
+                <w:bCs/>
+                <w:sz w:val="18"/>
+                <w:szCs w:val="18"/>
+              </w:rPr>
+              <w:t>Início</w:t>
+            </w:r>
+            <w:r>
+              <w:rPr>
+                <w:b/>
+                <w:bCs/>
+                <w:sz w:val="18"/>
+                <w:szCs w:val="18"/>
+              </w:rPr>
+              <w:t xml:space="preserve">: </w:t>
+            </w:r>
+            <w:r>
+              <w:rPr>
+                <w:color w:val="11437E"/>
+                <w:sz w:val="18"/>
+                <w:szCs w:val="18"/>
+              </w:rPr>
+              <w:t>{{</w:t>
+            </w:r>
+            <w:proofErr w:type="spellStart"/>
+            <w:r>
+              <w:rPr>
+                <w:color w:val="11437E"/>
+                <w:sz w:val="18"/>
+                <w:szCs w:val="18"/>
+              </w:rPr>
+              <w:t>starttime</w:t>
+            </w:r>
+            <w:proofErr w:type="spellEnd"/>
+            <w:r>
+              <w:rPr>
+                <w:color w:val="11437E"/>
+                <w:sz w:val="18"/>
+                <w:szCs w:val="18"/>
+              </w:rPr>
+              <w:t>}</w:t>
+            </w:r>
+            <w:r>
+              <w:rPr>
+                <w:color w:val="11437E"/>
+                <w:sz w:val="18"/>
+                <w:szCs w:val="18"/>
+              </w:rPr>
+              <w:t>}</w:t>
+            </w:r>
+          </w:p>
+        </w:tc>
+      </w:tr>
+      <w:tr>
+        <w:trPr>
+          <w:trHeight w:val="188"/>
+        </w:trPr>
+        <w:tc>
+          <w:tcPr>
+            <w:tcW w:w="4108" w:type="dxa"/>
+            <w:tcBorders>
+              <w:right w:val="single" w:sz="2" w:space="0" w:color="auto"/>
+            </w:tcBorders>
+          </w:tcPr>
+          <w:p>
+            <w:pPr>
+              <w:widowControl w:val="0"/>
+              <w:rPr>
+                <w:color w:val="11437E"/>
+                <w:sz w:val="18"/>
+                <w:szCs w:val="18"/>
+              </w:rPr>
+            </w:pPr>
+            <w:r>
+              <w:rPr>
+                <w:b/>
+                <w:bCs/>
+                <w:sz w:val="18"/>
+                <w:szCs w:val="18"/>
+              </w:rPr>
+              <w:t>Sistema:</w:t>
+            </w:r>
+            <w:r>
+              <w:rPr>
+                <w:color w:val="11437E"/>
+                <w:sz w:val="18"/>
+                <w:szCs w:val="18"/>
+              </w:rPr>
+              <w:t xml:space="preserve"> {{system}}</w:t>
+            </w:r>
+          </w:p>
+        </w:tc>
+        <w:tc>
+          <w:tcPr>
+            <w:tcW w:w="4253" w:type="dxa"/>
+            <w:tcBorders>
+              <w:top w:val="single" w:sz="2" w:space="0" w:color="auto"/>
+              <w:left w:val="single" w:sz="2" w:space="0" w:color="auto"/>
+              <w:bottom w:val="single" w:sz="2" w:space="0" w:color="auto"/>
+              <w:right w:val="single" w:sz="2" w:space="0" w:color="auto"/>
+            </w:tcBorders>
+          </w:tcPr>
+          <w:p>
+            <w:pPr>
+              <w:widowControl w:val="0"/>
+              <w:rPr>
+                <w:color w:val="11437E"/>
+                <w:sz w:val="18"/>
+                <w:szCs w:val="18"/>
+              </w:rPr>
+            </w:pPr>
+            <w:r>
+              <w:rPr>
+                <w:b/>
+                <w:bCs/>
+                <w:sz w:val="18"/>
+                <w:szCs w:val="18"/>
+              </w:rPr>
+              <w:t>Laudo</w:t>
+            </w:r>
+            <w:r>
+              <w:rPr>
+                <w:b/>
+                <w:bCs/>
+                <w:sz w:val="18"/>
+                <w:szCs w:val="18"/>
+              </w:rPr>
+              <w:t xml:space="preserve">: </w:t>
+            </w:r>
+            <w:r>
+              <w:rPr>
+                <w:color w:val="11437E"/>
+                <w:sz w:val="18"/>
+                <w:szCs w:val="18"/>
+              </w:rPr>
+              <w:t>{{</w:t>
+            </w:r>
+            <w:r>
+              <w:rPr>
+                <w:color w:val="11437E"/>
+                <w:sz w:val="18"/>
+                <w:szCs w:val="18"/>
+              </w:rPr>
+              <w:t>status</w:t>
+            </w:r>
+            <w:r>
+              <w:rPr>
+                <w:color w:val="11437E"/>
+                <w:sz w:val="18"/>
+                <w:szCs w:val="18"/>
+              </w:rPr>
+              <w:t>}}</w:t>
+            </w:r>
+          </w:p>
+        </w:tc>
+        <w:tc>
+          <w:tcPr>
+            <w:tcW w:w="1984" w:type="dxa"/>
+            <w:tcBorders>
+              <w:top w:val="single" w:sz="2" w:space="0" w:color="auto"/>
+              <w:left w:val="single" w:sz="2" w:space="0" w:color="auto"/>
+              <w:bottom w:val="single" w:sz="2" w:space="0" w:color="auto"/>
+              <w:right w:val="single" w:sz="2" w:space="0" w:color="auto"/>
+            </w:tcBorders>
+          </w:tcPr>
+          <w:p>
+            <w:pPr>
+              <w:widowControl w:val="0"/>
+              <w:rPr>
+                <w:color w:val="11437E"/>
+                <w:sz w:val="18"/>
+                <w:szCs w:val="18"/>
+              </w:rPr>
+            </w:pPr>
+            <w:r>
+              <w:rPr>
+                <w:b/>
+                <w:bCs/>
+                <w:sz w:val="18"/>
+                <w:szCs w:val="18"/>
+              </w:rPr>
+              <w:t>Término</w:t>
+            </w:r>
+            <w:r>
+              <w:rPr>
+                <w:b/>
+                <w:bCs/>
+                <w:sz w:val="18"/>
+                <w:szCs w:val="18"/>
+              </w:rPr>
+              <w:t xml:space="preserve">: </w:t>
+            </w:r>
+            <w:r>
+              <w:rPr>
+                <w:color w:val="11437E"/>
+                <w:sz w:val="18"/>
+                <w:szCs w:val="18"/>
+              </w:rPr>
+              <w:t>{{</w:t>
+            </w:r>
+            <w:proofErr w:type="spellStart"/>
+            <w:r>
+              <w:rPr>
+                <w:color w:val="11437E"/>
+                <w:sz w:val="18"/>
+                <w:szCs w:val="18"/>
+              </w:rPr>
+              <w:t>endtime</w:t>
+            </w:r>
+            <w:proofErr w:type="spellEnd"/>
+            <w:r>
+              <w:rPr>
+                <w:color w:val="11437E"/>
+                <w:sz w:val="18"/>
+                <w:szCs w:val="18"/>
+              </w:rPr>
+              <w:t>}}</w:t>
+            </w:r>
+          </w:p>
+        </w:tc>
+      </w:tr>
+      <w:tr>
+        <w:trPr>
+          <w:trHeight w:val="166"/>
+        </w:trPr>
+        <w:tc>
+          <w:tcPr>
+            <w:tcW w:w="10345" w:type="dxa"/>
+            <w:gridSpan w:val="3"/>
+            <w:tcBorders>
+              <w:right w:val="single" w:sz="2" w:space="0" w:color="auto"/>
+            </w:tcBorders>
+          </w:tcPr>
+          <w:p>
+            <w:pPr>
+              <w:widowControl w:val="0"/>
+              <w:rPr>
+                <w:b/>
+                <w:bCs/>
+                <w:sz w:val="18"/>
+                <w:szCs w:val="18"/>
+              </w:rPr>
+            </w:pPr>
+            <w:r>
+              <w:rPr>
+                <w:b/>
+                <w:bCs/>
+                <w:sz w:val="18"/>
+                <w:szCs w:val="18"/>
+              </w:rPr>
+              <w:t xml:space="preserve">Etapas da limpeza: </w:t>
+            </w:r>
+            <w:r>
+              <w:rPr>
+                <w:color w:val="11437E"/>
+                <w:sz w:val="18"/>
+                <w:szCs w:val="18"/>
+              </w:rPr>
+              <w:t>{{steps}}</w:t>
+            </w:r>
+          </w:p>
+        </w:tc>
+      </w:tr>
+    </w:tbl>
     <w:p>
       <w:pPr>
         <w:pStyle w:val="SemEspaamento"/>
@@ -9,471 +484,26 @@
     </w:p>
     <w:tbl>
       <w:tblPr>
-        <w:tblStyle w:val="a"/>
-        <w:tblpPr w:leftFromText="180" w:rightFromText="180" w:topFromText="180" w:bottomFromText="180" w:vertAnchor="text" w:tblpX="-675"/>
-        <w:tblW w:w="10338" w:type="dxa"/>
-        <w:tblInd w:w="0" w:type="dxa"/>
+        <w:tblW w:w="10350" w:type="dxa"/>
+        <w:jc w:val="center"/>
         <w:tblBorders>
-          <w:top w:val="single" w:sz="8" w:space="0" w:color="000000"/>
-          <w:left w:val="single" w:sz="8" w:space="0" w:color="000000"/>
-          <w:bottom w:val="single" w:sz="8" w:space="0" w:color="000000"/>
-          <w:right w:val="single" w:sz="8" w:space="0" w:color="000000"/>
-          <w:insideH w:val="single" w:sz="8" w:space="0" w:color="000000"/>
-          <w:insideV w:val="single" w:sz="8" w:space="0" w:color="000000"/>
+          <w:top w:val="single" w:sz="4" w:space="0" w:color="auto"/>
+          <w:left w:val="single" w:sz="4" w:space="0" w:color="auto"/>
+          <w:bottom w:val="single" w:sz="4" w:space="0" w:color="auto"/>
+          <w:right w:val="single" w:sz="4" w:space="0" w:color="auto"/>
+          <w:insideH w:val="single" w:sz="4" w:space="0" w:color="auto"/>
+          <w:insideV w:val="single" w:sz="4" w:space="0" w:color="auto"/>
         </w:tblBorders>
         <w:tblLayout w:type="fixed"/>
         <w:tblLook w:val="0600" w:firstRow="0" w:lastRow="0" w:firstColumn="0" w:lastColumn="0" w:noHBand="1" w:noVBand="1"/>
       </w:tblPr>
       <w:tblGrid>
-        <w:gridCol w:w="4101"/>
-        <w:gridCol w:w="4111"/>
-        <w:gridCol w:w="2126"/>
+        <w:gridCol w:w="5235"/>
+        <w:gridCol w:w="5115"/>
       </w:tblGrid>
       <w:tr>
         <w:trPr>
-          <w:trHeight w:val="20"/>
-        </w:trPr>
-        <w:tc>
-          <w:tcPr>
-            <w:tcW w:w="10338" w:type="dxa"/>
-            <w:gridSpan w:val="3"/>
-            <w:shd w:val="clear" w:color="auto" w:fill="30503A"/>
-          </w:tcPr>
-          <w:p>
-            <w:pPr>
-              <w:widowControl w:val="0"/>
-              <w:spacing w:line="216" w:lineRule="auto"/>
-              <w:jc w:val="center"/>
-              <w:rPr>
-                <w:b/>
-                <w:bCs/>
-                <w:color w:val="E8E8E8"/>
-                <w:sz w:val="18"/>
-                <w:szCs w:val="18"/>
-              </w:rPr>
-            </w:pPr>
-            <w:r>
-              <w:rPr>
-                <w:b/>
-                <w:bCs/>
-                <w:color w:val="E8E8E8"/>
-                <w:sz w:val="18"/>
-                <w:szCs w:val="18"/>
-              </w:rPr>
-              <w:t>INFORMAÇÕES DO SERVIÇO</w:t>
-            </w:r>
-          </w:p>
-        </w:tc>
-      </w:tr>
-      <w:tr>
-        <w:trPr>
-          <w:trHeight w:val="40"/>
-        </w:trPr>
-        <w:tc>
-          <w:tcPr>
-            <w:tcW w:w="4101" w:type="dxa"/>
-          </w:tcPr>
-          <w:p>
-            <w:pPr>
-              <w:widowControl w:val="0"/>
-              <w:spacing w:line="216" w:lineRule="auto"/>
-              <w:rPr>
-                <w:color w:val="11437E"/>
-                <w:sz w:val="18"/>
-                <w:szCs w:val="18"/>
-              </w:rPr>
-            </w:pPr>
-            <w:r>
-              <w:rPr>
-                <w:b/>
-                <w:bCs/>
-                <w:sz w:val="18"/>
-                <w:szCs w:val="18"/>
-              </w:rPr>
-              <w:t xml:space="preserve">Equipamento: </w:t>
-            </w:r>
-            <w:r>
-              <w:rPr>
-                <w:color w:val="11437E"/>
-                <w:sz w:val="18"/>
-                <w:szCs w:val="18"/>
-              </w:rPr>
-              <w:t>{{equipament}}</w:t>
-            </w:r>
-          </w:p>
-        </w:tc>
-        <w:tc>
-          <w:tcPr>
-            <w:tcW w:w="4111" w:type="dxa"/>
-          </w:tcPr>
-          <w:p>
-            <w:pPr>
-              <w:widowControl w:val="0"/>
-              <w:spacing w:line="216" w:lineRule="auto"/>
-              <w:rPr>
-                <w:b/>
-                <w:bCs/>
-                <w:sz w:val="18"/>
-                <w:szCs w:val="18"/>
-              </w:rPr>
-            </w:pPr>
-            <w:r>
-              <w:rPr>
-                <w:b/>
-                <w:bCs/>
-                <w:sz w:val="18"/>
-                <w:szCs w:val="18"/>
-              </w:rPr>
-              <w:t>Material:</w:t>
-            </w:r>
-            <w:r>
-              <w:rPr>
-                <w:b/>
-                <w:bCs/>
-                <w:sz w:val="18"/>
-                <w:szCs w:val="18"/>
-              </w:rPr>
-              <w:t xml:space="preserve"> </w:t>
-            </w:r>
-            <w:r>
-              <w:rPr>
-                <w:color w:val="11437E"/>
-                <w:sz w:val="18"/>
-                <w:szCs w:val="18"/>
-              </w:rPr>
-              <w:t>{{</w:t>
-            </w:r>
-            <w:r>
-              <w:rPr>
-                <w:color w:val="11437E"/>
-                <w:sz w:val="18"/>
-                <w:szCs w:val="18"/>
-              </w:rPr>
-              <w:t>material</w:t>
-            </w:r>
-            <w:r>
-              <w:rPr>
-                <w:color w:val="11437E"/>
-                <w:sz w:val="18"/>
-                <w:szCs w:val="18"/>
-              </w:rPr>
-              <w:t>}}</w:t>
-            </w:r>
-          </w:p>
-        </w:tc>
-        <w:tc>
-          <w:tcPr>
-            <w:tcW w:w="2126" w:type="dxa"/>
-          </w:tcPr>
-          <w:p>
-            <w:pPr>
-              <w:widowControl w:val="0"/>
-              <w:spacing w:line="216" w:lineRule="auto"/>
-              <w:rPr>
-                <w:b/>
-                <w:bCs/>
-                <w:sz w:val="18"/>
-                <w:szCs w:val="18"/>
-              </w:rPr>
-            </w:pPr>
-            <w:r>
-              <w:rPr>
-                <w:b/>
-                <w:bCs/>
-                <w:sz w:val="18"/>
-                <w:szCs w:val="18"/>
-              </w:rPr>
-              <w:t>Início</w:t>
-            </w:r>
-            <w:r>
-              <w:rPr>
-                <w:b/>
-                <w:bCs/>
-                <w:sz w:val="18"/>
-                <w:szCs w:val="18"/>
-              </w:rPr>
-              <w:t>:</w:t>
-            </w:r>
-            <w:r>
-              <w:rPr>
-                <w:b/>
-                <w:bCs/>
-                <w:sz w:val="18"/>
-                <w:szCs w:val="18"/>
-              </w:rPr>
-              <w:t xml:space="preserve"> </w:t>
-            </w:r>
-            <w:r>
-              <w:rPr>
-                <w:color w:val="11437E"/>
-                <w:sz w:val="18"/>
-                <w:szCs w:val="18"/>
-              </w:rPr>
-              <w:t>{{</w:t>
-            </w:r>
-            <w:r>
-              <w:rPr>
-                <w:color w:val="11437E"/>
-                <w:sz w:val="18"/>
-                <w:szCs w:val="18"/>
-              </w:rPr>
-              <w:t>starttime}</w:t>
-            </w:r>
-            <w:r>
-              <w:rPr>
-                <w:color w:val="11437E"/>
-                <w:sz w:val="18"/>
-                <w:szCs w:val="18"/>
-              </w:rPr>
-              <w:t>}</w:t>
-            </w:r>
-          </w:p>
-        </w:tc>
-      </w:tr>
-      <w:tr>
-        <w:trPr>
-          <w:trHeight w:val="20"/>
-        </w:trPr>
-        <w:tc>
-          <w:tcPr>
-            <w:tcW w:w="4101" w:type="dxa"/>
-          </w:tcPr>
-          <w:p>
-            <w:pPr>
-              <w:widowControl w:val="0"/>
-              <w:spacing w:line="216" w:lineRule="auto"/>
-              <w:rPr>
-                <w:b/>
-                <w:bCs/>
-                <w:sz w:val="18"/>
-                <w:szCs w:val="18"/>
-              </w:rPr>
-            </w:pPr>
-            <w:r>
-              <w:rPr>
-                <w:b/>
-                <w:bCs/>
-                <w:sz w:val="18"/>
-                <w:szCs w:val="18"/>
-              </w:rPr>
-              <w:t>Sistema:</w:t>
-            </w:r>
-            <w:r>
-              <w:rPr>
-                <w:b/>
-                <w:bCs/>
-                <w:sz w:val="18"/>
-                <w:szCs w:val="18"/>
-              </w:rPr>
-              <w:t xml:space="preserve"> </w:t>
-            </w:r>
-            <w:r>
-              <w:rPr>
-                <w:color w:val="11437E"/>
-                <w:sz w:val="18"/>
-                <w:szCs w:val="18"/>
-              </w:rPr>
-              <w:t>{{</w:t>
-            </w:r>
-            <w:r>
-              <w:rPr>
-                <w:color w:val="11437E"/>
-                <w:sz w:val="18"/>
-                <w:szCs w:val="18"/>
-              </w:rPr>
-              <w:t>system</w:t>
-            </w:r>
-            <w:r>
-              <w:rPr>
-                <w:color w:val="11437E"/>
-                <w:sz w:val="18"/>
-                <w:szCs w:val="18"/>
-              </w:rPr>
-              <w:t>}}</w:t>
-            </w:r>
-          </w:p>
-        </w:tc>
-        <w:tc>
-          <w:tcPr>
-            <w:tcW w:w="4111" w:type="dxa"/>
-          </w:tcPr>
-          <w:p>
-            <w:pPr>
-              <w:widowControl w:val="0"/>
-              <w:spacing w:line="216" w:lineRule="auto"/>
-              <w:rPr>
-                <w:b/>
-                <w:bCs/>
-                <w:sz w:val="18"/>
-                <w:szCs w:val="18"/>
-              </w:rPr>
-            </w:pPr>
-            <w:r>
-              <w:rPr>
-                <w:b/>
-                <w:bCs/>
-                <w:sz w:val="18"/>
-                <w:szCs w:val="18"/>
-              </w:rPr>
-              <w:t xml:space="preserve">Laudo: </w:t>
-            </w:r>
-            <w:r>
-              <w:rPr>
-                <w:color w:val="11437E"/>
-                <w:sz w:val="18"/>
-                <w:szCs w:val="18"/>
-              </w:rPr>
-              <w:t>{{status}}</w:t>
-            </w:r>
-          </w:p>
-        </w:tc>
-        <w:tc>
-          <w:tcPr>
-            <w:tcW w:w="2126" w:type="dxa"/>
-          </w:tcPr>
-          <w:p>
-            <w:pPr>
-              <w:widowControl w:val="0"/>
-              <w:spacing w:line="216" w:lineRule="auto"/>
-              <w:rPr>
-                <w:b/>
-                <w:bCs/>
-                <w:sz w:val="18"/>
-                <w:szCs w:val="18"/>
-              </w:rPr>
-            </w:pPr>
-            <w:r>
-              <w:rPr>
-                <w:b/>
-                <w:bCs/>
-                <w:sz w:val="18"/>
-                <w:szCs w:val="18"/>
-              </w:rPr>
-              <w:t>Término</w:t>
-            </w:r>
-            <w:r>
-              <w:rPr>
-                <w:b/>
-                <w:bCs/>
-                <w:sz w:val="18"/>
-                <w:szCs w:val="18"/>
-              </w:rPr>
-              <w:t>:</w:t>
-            </w:r>
-            <w:r>
-              <w:rPr>
-                <w:b/>
-                <w:bCs/>
-                <w:sz w:val="18"/>
-                <w:szCs w:val="18"/>
-              </w:rPr>
-              <w:t xml:space="preserve"> </w:t>
-            </w:r>
-            <w:r>
-              <w:rPr>
-                <w:color w:val="11437E"/>
-                <w:sz w:val="18"/>
-                <w:szCs w:val="18"/>
-              </w:rPr>
-              <w:t>{{</w:t>
-            </w:r>
-            <w:r>
-              <w:rPr>
-                <w:color w:val="11437E"/>
-                <w:sz w:val="18"/>
-                <w:szCs w:val="18"/>
-              </w:rPr>
-              <w:t>endtime</w:t>
-            </w:r>
-            <w:r>
-              <w:rPr>
-                <w:color w:val="11437E"/>
-                <w:sz w:val="18"/>
-                <w:szCs w:val="18"/>
-              </w:rPr>
-              <w:t>}}</w:t>
-            </w:r>
-          </w:p>
-        </w:tc>
-      </w:tr>
-      <w:tr>
-        <w:trPr>
-          <w:trHeight w:val="20"/>
-        </w:trPr>
-        <w:tc>
-          <w:tcPr>
-            <w:tcW w:w="10338" w:type="dxa"/>
-            <w:gridSpan w:val="3"/>
-          </w:tcPr>
-          <w:p>
-            <w:pPr>
-              <w:widowControl w:val="0"/>
-              <w:spacing w:line="216" w:lineRule="auto"/>
-              <w:rPr>
-                <w:b/>
-                <w:bCs/>
-                <w:sz w:val="18"/>
-                <w:szCs w:val="18"/>
-              </w:rPr>
-            </w:pPr>
-            <w:r>
-              <w:rPr>
-                <w:b/>
-                <w:bCs/>
-                <w:sz w:val="18"/>
-                <w:szCs w:val="18"/>
-              </w:rPr>
-              <w:t xml:space="preserve">Etapas da limpeza: </w:t>
-            </w:r>
-            <w:r>
-              <w:rPr>
-                <w:color w:val="11437E"/>
-                <w:sz w:val="18"/>
-                <w:szCs w:val="18"/>
-              </w:rPr>
-              <w:t>{{steps}}</w:t>
-            </w:r>
-          </w:p>
-        </w:tc>
-      </w:tr>
-    </w:tbl>
-    <w:p>
-      <w:pPr>
-        <w:spacing w:line="16" w:lineRule="auto"/>
-        <w:jc w:val="both"/>
-        <w:rPr>
-          <w:b/>
-          <w:bCs/>
-          <w:color w:val="30503A"/>
-          <w:sz w:val="28"/>
-          <w:szCs w:val="28"/>
-        </w:rPr>
-      </w:pPr>
-    </w:p>
-    <w:tbl>
-      <w:tblPr>
-        <w:tblStyle w:val="a0"/>
-        <w:tblW w:w="10350" w:type="dxa"/>
-        <w:jc w:val="center"/>
-        <w:tblInd w:w="0" w:type="dxa"/>
-        <w:tblBorders>
-          <w:top w:val="single" w:sz="8" w:space="0" w:color="000000"/>
-          <w:left w:val="single" w:sz="8" w:space="0" w:color="000000"/>
-          <w:bottom w:val="single" w:sz="8" w:space="0" w:color="000000"/>
-          <w:right w:val="single" w:sz="8" w:space="0" w:color="000000"/>
-          <w:insideH w:val="single" w:sz="8" w:space="0" w:color="000000"/>
-          <w:insideV w:val="single" w:sz="8" w:space="0" w:color="000000"/>
-        </w:tblBorders>
-        <w:tblLayout w:type="fixed"/>
-        <w:tblLook w:val="0600" w:firstRow="0" w:lastRow="0" w:firstColumn="0" w:lastColumn="0" w:noHBand="1" w:noVBand="1"/>
-      </w:tblPr>
-      <w:tblGrid>
-        <w:gridCol w:w="5377"/>
-        <w:gridCol w:w="4973"/>
-      </w:tblGrid>
-      <w:tr>
-        <w:trPr>
-          <w:trHeight w:val="20"/>
+          <w:trHeight w:val="363"/>
           <w:tblHeader/>
           <w:jc w:val="center"/>
         </w:trPr>
@@ -512,12 +542,12 @@
       </w:tr>
       <w:tr>
         <w:trPr>
-          <w:trHeight w:val="25"/>
+          <w:trHeight w:val="255"/>
           <w:jc w:val="center"/>
         </w:trPr>
         <w:tc>
           <w:tcPr>
-            <w:tcW w:w="5377" w:type="dxa"/>
+            <w:tcW w:w="5235" w:type="dxa"/>
             <w:shd w:val="clear" w:color="auto" w:fill="E8E8E8"/>
             <w:vAlign w:val="center"/>
           </w:tcPr>
@@ -546,7 +576,7 @@
         </w:tc>
         <w:tc>
           <w:tcPr>
-            <w:tcW w:w="4973" w:type="dxa"/>
+            <w:tcW w:w="5115" w:type="dxa"/>
             <w:shd w:val="clear" w:color="auto" w:fill="E8E8E8"/>
             <w:vAlign w:val="center"/>
           </w:tcPr>
@@ -576,12 +606,12 @@
       </w:tr>
       <w:tr>
         <w:trPr>
-          <w:trHeight w:val="25"/>
+          <w:trHeight w:val="272"/>
           <w:jc w:val="center"/>
         </w:trPr>
         <w:tc>
           <w:tcPr>
-            <w:tcW w:w="5377" w:type="dxa"/>
+            <w:tcW w:w="5235" w:type="dxa"/>
             <w:shd w:val="clear" w:color="auto" w:fill="FFFFFF"/>
             <w:vAlign w:val="center"/>
           </w:tcPr>
@@ -602,13 +632,31 @@
                 <w:sz w:val="18"/>
                 <w:szCs w:val="18"/>
               </w:rPr>
-              <w:t>{{collaboratorname}}</w:t>
+              <w:t>{{</w:t>
+            </w:r>
+            <w:proofErr w:type="spellStart"/>
+            <w:r>
+              <w:rPr>
+                <w:color w:val="11437E"/>
+                <w:sz w:val="18"/>
+                <w:szCs w:val="18"/>
+              </w:rPr>
+              <w:t>collaboratorname</w:t>
+            </w:r>
+            <w:proofErr w:type="spellEnd"/>
+            <w:r>
+              <w:rPr>
+                <w:color w:val="11437E"/>
+                <w:sz w:val="18"/>
+                <w:szCs w:val="18"/>
+              </w:rPr>
+              <w:t>}}</w:t>
             </w:r>
           </w:p>
         </w:tc>
         <w:tc>
           <w:tcPr>
-            <w:tcW w:w="4973" w:type="dxa"/>
+            <w:tcW w:w="5115" w:type="dxa"/>
             <w:vAlign w:val="center"/>
           </w:tcPr>
           <w:p>
@@ -628,24 +676,30 @@
                 <w:sz w:val="18"/>
                 <w:szCs w:val="18"/>
               </w:rPr>
-              <w:t>{{collaboratorposition}}</w:t>
+              <w:t>{{</w:t>
+            </w:r>
+            <w:proofErr w:type="spellStart"/>
+            <w:r>
+              <w:rPr>
+                <w:color w:val="11437E"/>
+                <w:sz w:val="18"/>
+                <w:szCs w:val="18"/>
+              </w:rPr>
+              <w:t>collaboratorposition</w:t>
+            </w:r>
+            <w:proofErr w:type="spellEnd"/>
+            <w:r>
+              <w:rPr>
+                <w:color w:val="11437E"/>
+                <w:sz w:val="18"/>
+                <w:szCs w:val="18"/>
+              </w:rPr>
+              <w:t>}}</w:t>
             </w:r>
           </w:p>
         </w:tc>
       </w:tr>
     </w:tbl>
-    <w:p>
-      <w:pPr>
-        <w:spacing w:line="240" w:lineRule="auto"/>
-        <w:rPr>
-          <w:b/>
-          <w:bCs/>
-          <w:color w:val="30503A"/>
-          <w:sz w:val="18"/>
-          <w:szCs w:val="18"/>
-        </w:rPr>
-      </w:pPr>
-    </w:p>
     <w:p>
       <w:pPr>
         <w:widowControl w:val="0"/>
@@ -669,7 +723,15 @@
       <w:tblPr>
         <w:tblStyle w:val="Tabelacomgrade"/>
         <w:tblW w:w="10348" w:type="dxa"/>
-        <w:jc w:val="center"/>
+        <w:tblInd w:w="-666" w:type="dxa"/>
+        <w:tblBorders>
+          <w:top w:val="single" w:sz="2" w:space="0" w:color="auto"/>
+          <w:left w:val="single" w:sz="2" w:space="0" w:color="auto"/>
+          <w:bottom w:val="single" w:sz="2" w:space="0" w:color="auto"/>
+          <w:right w:val="single" w:sz="2" w:space="0" w:color="auto"/>
+          <w:insideH w:val="single" w:sz="2" w:space="0" w:color="auto"/>
+          <w:insideV w:val="single" w:sz="2" w:space="0" w:color="auto"/>
+        </w:tblBorders>
         <w:tblLook w:val="04A0" w:firstRow="1" w:lastRow="0" w:firstColumn="1" w:lastColumn="0" w:noHBand="0" w:noVBand="1"/>
       </w:tblPr>
       <w:tblGrid>
@@ -680,7 +742,6 @@
           <w:cantSplit/>
           <w:trHeight w:val="449"/>
           <w:tblHeader/>
-          <w:jc w:val="center"/>
         </w:trPr>
         <w:tc>
           <w:tcPr>
@@ -698,6 +759,7 @@
                 <w:color w:val="E8E8E8"/>
                 <w:sz w:val="18"/>
                 <w:szCs w:val="18"/>
+                <w:u w:val="single"/>
               </w:rPr>
             </w:pPr>
             <w:r>
@@ -708,45 +770,14 @@
                 <w:sz w:val="18"/>
                 <w:szCs w:val="18"/>
               </w:rPr>
-              <w:t>REGISTRO</w:t>
-            </w:r>
-            <w:r>
-              <w:rPr>
-                <w:b/>
-                <w:bCs/>
-                <w:color w:val="E8E8E8"/>
-                <w:sz w:val="18"/>
-                <w:szCs w:val="18"/>
-              </w:rPr>
-              <w:t>S</w:t>
-            </w:r>
-            <w:r>
-              <w:rPr>
-                <w:b/>
-                <w:bCs/>
-                <w:color w:val="E8E8E8"/>
-                <w:sz w:val="18"/>
-                <w:szCs w:val="18"/>
-              </w:rPr>
-              <w:t xml:space="preserve"> </w:t>
-            </w:r>
-            <w:r>
-              <w:rPr>
-                <w:b/>
-                <w:bCs/>
-                <w:color w:val="E8E8E8"/>
-                <w:sz w:val="18"/>
-                <w:szCs w:val="18"/>
-              </w:rPr>
-              <w:t>FOTOGRÁFICOS</w:t>
+              <w:t>REGISTROS FOTOGRÁFICOS</w:t>
             </w:r>
           </w:p>
         </w:tc>
       </w:tr>
       <w:tr>
         <w:trPr>
-          <w:trHeight w:val="5986"/>
-          <w:jc w:val="center"/>
+          <w:trHeight w:val="4024"/>
         </w:trPr>
         <w:tc>
           <w:tcPr>
@@ -769,6 +800,7 @@
               </w:rPr>
               <w:t>{{</w:t>
             </w:r>
+            <w:proofErr w:type="spellStart"/>
             <w:r>
               <w:rPr>
                 <w:color w:val="11437E"/>
@@ -777,6 +809,7 @@
               </w:rPr>
               <w:t>cleaningphotos</w:t>
             </w:r>
+            <w:proofErr w:type="spellEnd"/>
             <w:r>
               <w:rPr>
                 <w:color w:val="11437E"/>
@@ -888,39 +921,20 @@
         </w:tc>
       </w:tr>
     </w:tbl>
-    <w:p>
-      <w:pPr>
-        <w:widowControl w:val="0"/>
-        <w:pBdr>
-          <w:top w:val="nil"/>
-          <w:left w:val="nil"/>
-          <w:bottom w:val="nil"/>
-          <w:right w:val="nil"/>
-          <w:between w:val="nil"/>
-        </w:pBdr>
-        <w:rPr>
-          <w:b/>
-          <w:bCs/>
-          <w:color w:val="30503A"/>
-          <w:sz w:val="28"/>
-          <w:szCs w:val="28"/>
-        </w:rPr>
-      </w:pPr>
-    </w:p>
     <w:p/>
     <w:tbl>
       <w:tblPr>
         <w:tblStyle w:val="a1"/>
+        <w:tblpPr w:leftFromText="141" w:rightFromText="141" w:vertAnchor="text" w:horzAnchor="margin" w:tblpXSpec="center" w:tblpY="68"/>
         <w:tblW w:w="10350" w:type="dxa"/>
-        <w:jc w:val="center"/>
         <w:tblInd w:w="0" w:type="dxa"/>
         <w:tblBorders>
-          <w:top w:val="single" w:sz="8" w:space="0" w:color="000000"/>
-          <w:left w:val="single" w:sz="8" w:space="0" w:color="000000"/>
-          <w:bottom w:val="single" w:sz="8" w:space="0" w:color="000000"/>
-          <w:right w:val="single" w:sz="8" w:space="0" w:color="000000"/>
-          <w:insideH w:val="single" w:sz="8" w:space="0" w:color="000000"/>
-          <w:insideV w:val="single" w:sz="8" w:space="0" w:color="000000"/>
+          <w:top w:val="single" w:sz="2" w:space="0" w:color="auto"/>
+          <w:left w:val="single" w:sz="2" w:space="0" w:color="auto"/>
+          <w:bottom w:val="single" w:sz="2" w:space="0" w:color="auto"/>
+          <w:right w:val="single" w:sz="2" w:space="0" w:color="auto"/>
+          <w:insideH w:val="single" w:sz="2" w:space="0" w:color="auto"/>
+          <w:insideV w:val="single" w:sz="2" w:space="0" w:color="auto"/>
         </w:tblBorders>
         <w:tblLayout w:type="fixed"/>
         <w:tblLook w:val="0600" w:firstRow="0" w:lastRow="0" w:firstColumn="0" w:lastColumn="0" w:noHBand="1" w:noVBand="1"/>
@@ -932,7 +946,6 @@
         <w:trPr>
           <w:trHeight w:val="308"/>
           <w:tblHeader/>
-          <w:jc w:val="center"/>
         </w:trPr>
         <w:tc>
           <w:tcPr>
@@ -969,8 +982,7 @@
       <w:tr>
         <w:trPr>
           <w:cantSplit/>
-          <w:trHeight w:val="2034"/>
-          <w:jc w:val="center"/>
+          <w:trHeight w:val="233"/>
         </w:trPr>
         <w:tc>
           <w:tcPr>
@@ -992,17 +1004,36 @@
                 <w:sz w:val="18"/>
                 <w:szCs w:val="18"/>
               </w:rPr>
-              <w:t>{{obs}}</w:t>
+              <w:t>{{</w:t>
+            </w:r>
+            <w:proofErr w:type="spellStart"/>
+            <w:r>
+              <w:rPr>
+                <w:color w:val="11437E"/>
+                <w:sz w:val="18"/>
+                <w:szCs w:val="18"/>
+              </w:rPr>
+              <w:t>obs</w:t>
+            </w:r>
+            <w:proofErr w:type="spellEnd"/>
+            <w:r>
+              <w:rPr>
+                <w:color w:val="11437E"/>
+                <w:sz w:val="18"/>
+                <w:szCs w:val="18"/>
+              </w:rPr>
+              <w:t>}}</w:t>
             </w:r>
           </w:p>
         </w:tc>
       </w:tr>
     </w:tbl>
+    <w:p/>
     <w:tbl>
       <w:tblPr>
         <w:tblStyle w:val="a4"/>
-        <w:tblpPr w:leftFromText="141" w:rightFromText="141" w:vertAnchor="text" w:horzAnchor="margin" w:tblpXSpec="center" w:tblpY="444"/>
         <w:tblW w:w="10335" w:type="dxa"/>
+        <w:jc w:val="center"/>
         <w:tblInd w:w="0" w:type="dxa"/>
         <w:tblLayout w:type="fixed"/>
         <w:tblLook w:val="0600" w:firstRow="0" w:lastRow="0" w:firstColumn="0" w:lastColumn="0" w:noHBand="1" w:noVBand="1"/>
@@ -1017,6 +1048,7 @@
           <w:cantSplit/>
           <w:trHeight w:val="1092"/>
           <w:tblHeader/>
+          <w:jc w:val="center"/>
         </w:trPr>
         <w:tc>
           <w:tcPr>
@@ -1095,7 +1127,21 @@
               <w:rPr>
                 <w:color w:val="11437E"/>
               </w:rPr>
-              <w:t xml:space="preserve"> {{leadername}}</w:t>
+              <w:t xml:space="preserve"> {{</w:t>
+            </w:r>
+            <w:proofErr w:type="spellStart"/>
+            <w:r>
+              <w:rPr>
+                <w:color w:val="11437E"/>
+              </w:rPr>
+              <w:t>leadername</w:t>
+            </w:r>
+            <w:proofErr w:type="spellEnd"/>
+            <w:r>
+              <w:rPr>
+                <w:color w:val="11437E"/>
+              </w:rPr>
+              <w:t>}}</w:t>
             </w:r>
           </w:p>
           <w:p>
@@ -1117,7 +1163,21 @@
               <w:rPr>
                 <w:color w:val="11437E"/>
               </w:rPr>
-              <w:t>{{leaderposition}}</w:t>
+              <w:t>{{</w:t>
+            </w:r>
+            <w:proofErr w:type="spellStart"/>
+            <w:r>
+              <w:rPr>
+                <w:color w:val="11437E"/>
+              </w:rPr>
+              <w:t>leaderposition</w:t>
+            </w:r>
+            <w:proofErr w:type="spellEnd"/>
+            <w:r>
+              <w:rPr>
+                <w:color w:val="11437E"/>
+              </w:rPr>
+              <w:t>}}</w:t>
             </w:r>
           </w:p>
         </w:tc>
@@ -1168,6 +1228,7 @@
           <w:p>
             <w:pPr>
               <w:widowControl w:val="0"/>
+              <w:spacing w:line="240" w:lineRule="auto"/>
               <w:rPr>
                 <w:b/>
                 <w:bCs/>
@@ -1203,31 +1264,6 @@
     </w:tbl>
     <w:p>
       <w:pPr>
-        <w:spacing w:line="240" w:lineRule="auto"/>
-        <w:rPr>
-          <w:b/>
-          <w:bCs/>
-          <w:color w:val="30503A"/>
-          <w:sz w:val="28"/>
-          <w:szCs w:val="28"/>
-        </w:rPr>
-      </w:pPr>
-    </w:p>
-    <w:p>
-      <w:pPr>
-        <w:spacing w:line="240" w:lineRule="auto"/>
-        <w:rPr>
-          <w:b/>
-          <w:bCs/>
-          <w:color w:val="30503A"/>
-          <w:sz w:val="28"/>
-          <w:szCs w:val="28"/>
-        </w:rPr>
-      </w:pPr>
-    </w:p>
-    <w:p>
-      <w:pPr>
-        <w:spacing w:line="240" w:lineRule="auto"/>
         <w:rPr>
           <w:b/>
           <w:bCs/>
@@ -1306,39 +1342,7 @@
         <w:sz w:val="18"/>
         <w:szCs w:val="18"/>
       </w:rPr>
-      <w:t>Limpeza Mecânica</w:t>
-    </w:r>
-    <w:r>
-      <w:rPr>
-        <w:color w:val="E8E8E8"/>
-        <w:sz w:val="18"/>
-        <w:szCs w:val="18"/>
-      </w:rPr>
-      <w:t xml:space="preserve"> </w:t>
-    </w:r>
-    <w:r>
-      <w:rPr>
-        <w:color w:val="E8E8E8"/>
-        <w:sz w:val="18"/>
-        <w:szCs w:val="18"/>
-      </w:rPr>
-      <w:t>(</w:t>
-    </w:r>
-    <w:r>
-      <w:rPr>
-        <w:color w:val="E8E8E8"/>
-        <w:sz w:val="18"/>
-        <w:szCs w:val="18"/>
-      </w:rPr>
-      <w:t>RLM</w:t>
-    </w:r>
-    <w:r>
-      <w:rPr>
-        <w:color w:val="E8E8E8"/>
-        <w:sz w:val="18"/>
-        <w:szCs w:val="18"/>
-      </w:rPr>
-      <w:t>)</w:t>
+      <w:t>Limpeza Mecânica (RLM)</w:t>
     </w:r>
   </w:p>
   <w:p>
@@ -1728,6 +1732,13 @@
     <w:pPr>
       <w:spacing w:line="240" w:lineRule="auto"/>
       <w:jc w:val="center"/>
+      <w:rPr>
+        <w:b/>
+        <w:bCs/>
+        <w:color w:val="30503A"/>
+        <w:sz w:val="28"/>
+        <w:szCs w:val="28"/>
+      </w:rPr>
     </w:pPr>
     <w:r>
       <w:rPr>
@@ -1760,55 +1771,37 @@
       <w:t>LIMPEZA MECÂNICA</w:t>
     </w:r>
   </w:p>
-  <w:p>
-    <w:pPr>
-      <w:spacing w:line="240" w:lineRule="auto"/>
-      <w:jc w:val="center"/>
-      <w:rPr>
-        <w:color w:val="30503A"/>
-      </w:rPr>
-    </w:pPr>
-  </w:p>
   <w:tbl>
     <w:tblPr>
-      <w:tblStyle w:val="a5"/>
-      <w:tblpPr w:leftFromText="180" w:rightFromText="180" w:topFromText="180" w:bottomFromText="180" w:vertAnchor="text" w:tblpX="-675"/>
-      <w:tblW w:w="10350" w:type="dxa"/>
-      <w:tblInd w:w="0" w:type="dxa"/>
-      <w:tblBorders>
-        <w:top w:val="single" w:sz="8" w:space="0" w:color="000000"/>
-        <w:left w:val="single" w:sz="8" w:space="0" w:color="000000"/>
-        <w:bottom w:val="single" w:sz="8" w:space="0" w:color="000000"/>
-        <w:right w:val="single" w:sz="8" w:space="0" w:color="000000"/>
-        <w:insideH w:val="single" w:sz="8" w:space="0" w:color="000000"/>
-        <w:insideV w:val="single" w:sz="8" w:space="0" w:color="000000"/>
-      </w:tblBorders>
-      <w:tblLayout w:type="fixed"/>
-      <w:tblLook w:val="0600" w:firstRow="0" w:lastRow="0" w:firstColumn="0" w:lastColumn="0" w:noHBand="1" w:noVBand="1"/>
+      <w:tblStyle w:val="Tabelacomgrade"/>
+      <w:tblW w:w="10343" w:type="dxa"/>
+      <w:jc w:val="center"/>
+      <w:tblLook w:val="04A0" w:firstRow="1" w:lastRow="0" w:firstColumn="1" w:lastColumn="0" w:noHBand="0" w:noVBand="1"/>
     </w:tblPr>
     <w:tblGrid>
-      <w:gridCol w:w="4950"/>
-      <w:gridCol w:w="3540"/>
-      <w:gridCol w:w="1860"/>
+      <w:gridCol w:w="4957"/>
+      <w:gridCol w:w="7"/>
+      <w:gridCol w:w="3536"/>
+      <w:gridCol w:w="1843"/>
     </w:tblGrid>
     <w:tr>
       <w:trPr>
-        <w:trHeight w:val="25"/>
+        <w:trHeight w:val="414"/>
+        <w:jc w:val="center"/>
       </w:trPr>
       <w:tc>
         <w:tcPr>
-          <w:tcW w:w="10350" w:type="dxa"/>
-          <w:gridSpan w:val="3"/>
-          <w:shd w:val="clear" w:color="auto" w:fill="30503E"/>
+          <w:tcW w:w="10343" w:type="dxa"/>
+          <w:gridSpan w:val="4"/>
+          <w:shd w:val="clear" w:color="auto" w:fill="30503A"/>
           <w:vAlign w:val="center"/>
         </w:tcPr>
         <w:p>
           <w:pPr>
             <w:jc w:val="center"/>
             <w:rPr>
-              <w:b/>
-              <w:bCs/>
-              <w:color w:val="E8E8E8"/>
+              <w:sz w:val="24"/>
+              <w:szCs w:val="24"/>
             </w:rPr>
           </w:pPr>
           <w:r>
@@ -1816,35 +1809,47 @@
               <w:b/>
               <w:bCs/>
               <w:color w:val="E8E8E8"/>
-              <w:sz w:val="18"/>
-              <w:szCs w:val="18"/>
+              <w:sz w:val="24"/>
+              <w:szCs w:val="24"/>
             </w:rPr>
-            <w:t>{{missiontitle}}</w:t>
+            <w:t>{{</w:t>
+          </w:r>
+          <w:proofErr w:type="spellStart"/>
+          <w:r>
+            <w:rPr>
+              <w:b/>
+              <w:bCs/>
+              <w:color w:val="E8E8E8"/>
+            </w:rPr>
+            <w:t>missiontitle</w:t>
+          </w:r>
+          <w:proofErr w:type="spellEnd"/>
+          <w:r>
+            <w:rPr>
+              <w:b/>
+              <w:bCs/>
+              <w:color w:val="E8E8E8"/>
+              <w:sz w:val="24"/>
+              <w:szCs w:val="24"/>
+            </w:rPr>
+            <w:t>}}</w:t>
           </w:r>
         </w:p>
       </w:tc>
     </w:tr>
     <w:tr>
       <w:trPr>
-        <w:trHeight w:val="20"/>
+        <w:trHeight w:val="278"/>
+        <w:jc w:val="center"/>
       </w:trPr>
       <w:tc>
         <w:tcPr>
-          <w:tcW w:w="4950" w:type="dxa"/>
+          <w:tcW w:w="4964" w:type="dxa"/>
+          <w:gridSpan w:val="2"/>
           <w:shd w:val="clear" w:color="auto" w:fill="E8E8E8"/>
+          <w:vAlign w:val="center"/>
         </w:tcPr>
         <w:p>
-          <w:pPr>
-            <w:widowControl w:val="0"/>
-            <w:spacing w:line="240" w:lineRule="auto"/>
-            <w:rPr>
-              <w:b/>
-              <w:bCs/>
-              <w:color w:val="11437E"/>
-              <w:sz w:val="18"/>
-              <w:szCs w:val="18"/>
-            </w:rPr>
-          </w:pPr>
           <w:r>
             <w:rPr>
               <w:b/>
@@ -1862,19 +1867,10 @@
               <w:sz w:val="18"/>
               <w:szCs w:val="18"/>
             </w:rPr>
-            <w:t>{{client}}</w:t>
+            <w:t>{{</w:t>
           </w:r>
-        </w:p>
-      </w:tc>
-      <w:tc>
-        <w:tcPr>
-          <w:tcW w:w="3540" w:type="dxa"/>
-          <w:shd w:val="clear" w:color="auto" w:fill="E8E8E8"/>
-        </w:tcPr>
-        <w:p>
-          <w:pPr>
-            <w:widowControl w:val="0"/>
-            <w:spacing w:line="240" w:lineRule="auto"/>
+          <w:proofErr w:type="spellStart"/>
+          <w:r>
             <w:rPr>
               <w:b/>
               <w:bCs/>
@@ -1882,7 +1878,28 @@
               <w:sz w:val="18"/>
               <w:szCs w:val="18"/>
             </w:rPr>
-          </w:pPr>
+            <w:t>client</w:t>
+          </w:r>
+          <w:proofErr w:type="spellEnd"/>
+          <w:r>
+            <w:rPr>
+              <w:b/>
+              <w:bCs/>
+              <w:color w:val="11437E"/>
+              <w:sz w:val="18"/>
+              <w:szCs w:val="18"/>
+            </w:rPr>
+            <w:t>}}</w:t>
+          </w:r>
+        </w:p>
+      </w:tc>
+      <w:tc>
+        <w:tcPr>
+          <w:tcW w:w="3536" w:type="dxa"/>
+          <w:shd w:val="clear" w:color="auto" w:fill="E8E8E8"/>
+          <w:vAlign w:val="center"/>
+        </w:tcPr>
+        <w:p>
           <w:r>
             <w:rPr>
               <w:b/>
@@ -1900,19 +1917,10 @@
               <w:sz w:val="18"/>
               <w:szCs w:val="18"/>
             </w:rPr>
-            <w:t>{{proposal}}</w:t>
+            <w:t>{{</w:t>
           </w:r>
-        </w:p>
-      </w:tc>
-      <w:tc>
-        <w:tcPr>
-          <w:tcW w:w="1860" w:type="dxa"/>
-          <w:shd w:val="clear" w:color="auto" w:fill="E8E8E8"/>
-        </w:tcPr>
-        <w:p>
-          <w:pPr>
-            <w:widowControl w:val="0"/>
-            <w:spacing w:line="240" w:lineRule="auto"/>
+          <w:proofErr w:type="spellStart"/>
+          <w:r>
             <w:rPr>
               <w:b/>
               <w:bCs/>
@@ -1920,7 +1928,28 @@
               <w:sz w:val="18"/>
               <w:szCs w:val="18"/>
             </w:rPr>
-          </w:pPr>
+            <w:t>proposal</w:t>
+          </w:r>
+          <w:proofErr w:type="spellEnd"/>
+          <w:r>
+            <w:rPr>
+              <w:b/>
+              <w:bCs/>
+              <w:color w:val="11437E"/>
+              <w:sz w:val="18"/>
+              <w:szCs w:val="18"/>
+            </w:rPr>
+            <w:t>}}</w:t>
+          </w:r>
+        </w:p>
+      </w:tc>
+      <w:tc>
+        <w:tcPr>
+          <w:tcW w:w="1843" w:type="dxa"/>
+          <w:shd w:val="clear" w:color="auto" w:fill="E8E8E8"/>
+          <w:vAlign w:val="center"/>
+        </w:tcPr>
+        <w:p>
           <w:r>
             <w:rPr>
               <w:b/>
@@ -1928,7 +1957,7 @@
               <w:sz w:val="18"/>
               <w:szCs w:val="18"/>
             </w:rPr>
-            <w:t xml:space="preserve">RLM </w:t>
+            <w:t>RLM</w:t>
           </w:r>
           <w:r>
             <w:rPr>
@@ -1937,7 +1966,7 @@
               <w:sz w:val="18"/>
               <w:szCs w:val="18"/>
             </w:rPr>
-            <w:t>nº:</w:t>
+            <w:t xml:space="preserve"> nº:</w:t>
           </w:r>
           <w:r>
             <w:rPr>
@@ -1958,6 +1987,7 @@
             </w:rPr>
             <w:t>{{</w:t>
           </w:r>
+          <w:proofErr w:type="spellStart"/>
           <w:r>
             <w:rPr>
               <w:b/>
@@ -1966,8 +1996,19 @@
               <w:sz w:val="18"/>
               <w:szCs w:val="18"/>
             </w:rPr>
-            <w:t>rlm</w:t>
+            <w:t>r</w:t>
           </w:r>
+          <w:r>
+            <w:rPr>
+              <w:b/>
+              <w:bCs/>
+              <w:color w:val="11437E"/>
+              <w:sz w:val="18"/>
+              <w:szCs w:val="18"/>
+            </w:rPr>
+            <w:t>lm</w:t>
+          </w:r>
+          <w:proofErr w:type="spellEnd"/>
           <w:r>
             <w:rPr>
               <w:b/>
@@ -1983,25 +2024,16 @@
     </w:tr>
     <w:tr>
       <w:trPr>
-        <w:trHeight w:val="20"/>
+        <w:trHeight w:val="338"/>
+        <w:jc w:val="center"/>
       </w:trPr>
       <w:tc>
         <w:tcPr>
-          <w:tcW w:w="4950" w:type="dxa"/>
+          <w:tcW w:w="4957" w:type="dxa"/>
           <w:shd w:val="clear" w:color="auto" w:fill="E8E8E8"/>
+          <w:vAlign w:val="center"/>
         </w:tcPr>
         <w:p>
-          <w:pPr>
-            <w:widowControl w:val="0"/>
-            <w:spacing w:line="240" w:lineRule="auto"/>
-            <w:rPr>
-              <w:b/>
-              <w:bCs/>
-              <w:color w:val="11437E"/>
-              <w:sz w:val="18"/>
-              <w:szCs w:val="18"/>
-            </w:rPr>
-          </w:pPr>
           <w:r>
             <w:rPr>
               <w:b/>
@@ -2019,20 +2051,10 @@
               <w:sz w:val="18"/>
               <w:szCs w:val="18"/>
             </w:rPr>
-            <w:t xml:space="preserve"> {{cnpj}}</w:t>
+            <w:t xml:space="preserve"> {{</w:t>
           </w:r>
-        </w:p>
-      </w:tc>
-      <w:tc>
-        <w:tcPr>
-          <w:tcW w:w="5400" w:type="dxa"/>
-          <w:gridSpan w:val="2"/>
-          <w:shd w:val="clear" w:color="auto" w:fill="E8E8E8"/>
-        </w:tcPr>
-        <w:p>
-          <w:pPr>
-            <w:widowControl w:val="0"/>
-            <w:spacing w:line="240" w:lineRule="auto"/>
+          <w:proofErr w:type="spellStart"/>
+          <w:r>
             <w:rPr>
               <w:b/>
               <w:bCs/>
@@ -2040,7 +2062,29 @@
               <w:sz w:val="18"/>
               <w:szCs w:val="18"/>
             </w:rPr>
-          </w:pPr>
+            <w:t>cnpj</w:t>
+          </w:r>
+          <w:proofErr w:type="spellEnd"/>
+          <w:r>
+            <w:rPr>
+              <w:b/>
+              <w:bCs/>
+              <w:color w:val="11437E"/>
+              <w:sz w:val="18"/>
+              <w:szCs w:val="18"/>
+            </w:rPr>
+            <w:t>}}</w:t>
+          </w:r>
+        </w:p>
+      </w:tc>
+      <w:tc>
+        <w:tcPr>
+          <w:tcW w:w="5386" w:type="dxa"/>
+          <w:gridSpan w:val="3"/>
+          <w:shd w:val="clear" w:color="auto" w:fill="E8E8E8"/>
+          <w:vAlign w:val="center"/>
+        </w:tcPr>
+        <w:p>
           <w:r>
             <w:rPr>
               <w:b/>
@@ -2065,26 +2109,17 @@
     </w:tr>
     <w:tr>
       <w:trPr>
-        <w:trHeight w:val="20"/>
+        <w:trHeight w:val="270"/>
+        <w:jc w:val="center"/>
       </w:trPr>
       <w:tc>
         <w:tcPr>
-          <w:tcW w:w="10350" w:type="dxa"/>
-          <w:gridSpan w:val="3"/>
+          <w:tcW w:w="10343" w:type="dxa"/>
+          <w:gridSpan w:val="4"/>
           <w:shd w:val="clear" w:color="auto" w:fill="E8E8E8"/>
+          <w:vAlign w:val="center"/>
         </w:tcPr>
         <w:p>
-          <w:pPr>
-            <w:widowControl w:val="0"/>
-            <w:spacing w:line="240" w:lineRule="auto"/>
-            <w:rPr>
-              <w:b/>
-              <w:bCs/>
-              <w:color w:val="11437E"/>
-              <w:sz w:val="18"/>
-              <w:szCs w:val="18"/>
-            </w:rPr>
-          </w:pPr>
           <w:r>
             <w:rPr>
               <w:b/>
@@ -2108,6 +2143,19 @@
       </w:tc>
     </w:tr>
   </w:tbl>
+  <w:p>
+    <w:pPr>
+      <w:spacing w:line="240" w:lineRule="auto"/>
+      <w:jc w:val="center"/>
+      <w:rPr>
+        <w:b/>
+        <w:bCs/>
+        <w:color w:val="30503A"/>
+        <w:sz w:val="28"/>
+        <w:szCs w:val="28"/>
+      </w:rPr>
+    </w:pPr>
+  </w:p>
   <w:p>
     <w:pPr>
       <w:spacing w:line="16" w:lineRule="auto"/>
@@ -2529,7 +2577,7 @@
   <w:style w:type="paragraph" w:default="1" w:styleId="Normal">
     <w:name w:val="Normal"/>
     <w:qFormat/>
-    <w:rsid w:val="00987E1F"/>
+    <w:rsid w:val="001171DA"/>
   </w:style>
   <w:style w:type="paragraph" w:styleId="Ttulo1">
     <w:name w:val="heading 1"/>

</xml_diff>